<commit_message>
One-pager: drop the unresolved-residence row from Finding 02
A single admission with unresolved residence earned a table row of its own
in a four-row table. Removed. The admission stays inside the 344 total and
is footnoted, so the three group rows still reconcile against that total
rather than appearing to fall one short.

Co-Authored-By: Claude Opus 5 <noreply@anthropic.com>
Claude-Session: https://claude.ai/code/session_01SGUCGF1gPhoJecFCMyrAt2
</commit_message>
<xml_diff>
--- a/reports/Cochrane-Demand-and-Capacity-Summary.docx
+++ b/reports/Cochrane-Demand-and-Capacity-Summary.docx
@@ -3508,136 +3508,6 @@
               <w:bottom w:val="single" w:color="DDE2DE" w:sz="4"/>
               <w:right w:val="single" w:color="DDE2DE" w:sz="4"/>
             </w:tcBorders>
-            <w:tcMar>
-              <w:top w:type="dxa" w:w="70"/>
-              <w:left w:type="dxa" w:w="120"/>
-              <w:bottom w:type="dxa" w:w="70"/>
-              <w:right w:type="dxa" w:w="120"/>
-            </w:tcMar>
-          </w:tcPr>
-          <w:p>
-            <w:pPr>
-              <w:spacing w:after="0" w:line="240"/>
-              <w:jc w:val="left"/>
-            </w:pPr>
-            <w:r>
-              <w:rPr>
-                <w:rFonts w:ascii="Calibri" w:cs="Calibri" w:eastAsia="Calibri" w:hAnsi="Calibri"/>
-                <w:color w:val="15201C"/>
-                <w:sz w:val="18"/>
-                <w:szCs w:val="18"/>
-              </w:rPr>
-              <w:t xml:space="preserve">Residence unresolved</w:t>
-            </w:r>
-          </w:p>
-        </w:tc>
-        <w:tc>
-          <w:tcPr>
-            <w:tcW w:type="dxa" w:w="1700"/>
-            <w:tcBorders>
-              <w:top w:val="single" w:color="DDE2DE" w:sz="4"/>
-              <w:left w:val="single" w:color="DDE2DE" w:sz="4"/>
-              <w:bottom w:val="single" w:color="DDE2DE" w:sz="4"/>
-              <w:right w:val="single" w:color="DDE2DE" w:sz="4"/>
-            </w:tcBorders>
-            <w:tcMar>
-              <w:top w:type="dxa" w:w="70"/>
-              <w:left w:type="dxa" w:w="120"/>
-              <w:bottom w:type="dxa" w:w="70"/>
-              <w:right w:type="dxa" w:w="120"/>
-            </w:tcMar>
-          </w:tcPr>
-          <w:p>
-            <w:pPr>
-              <w:spacing w:after="0" w:line="240"/>
-              <w:jc w:val="right"/>
-            </w:pPr>
-            <w:r>
-              <w:rPr>
-                <w:rFonts w:ascii="Calibri" w:cs="Calibri" w:eastAsia="Calibri" w:hAnsi="Calibri"/>
-                <w:color w:val="15201C"/>
-                <w:sz w:val="18"/>
-                <w:szCs w:val="18"/>
-              </w:rPr>
-              <w:t xml:space="preserve">1</w:t>
-            </w:r>
-          </w:p>
-        </w:tc>
-        <w:tc>
-          <w:tcPr>
-            <w:tcW w:type="dxa" w:w="1600"/>
-            <w:tcBorders>
-              <w:top w:val="single" w:color="DDE2DE" w:sz="4"/>
-              <w:left w:val="single" w:color="DDE2DE" w:sz="4"/>
-              <w:bottom w:val="single" w:color="DDE2DE" w:sz="4"/>
-              <w:right w:val="single" w:color="DDE2DE" w:sz="4"/>
-            </w:tcBorders>
-            <w:tcMar>
-              <w:top w:type="dxa" w:w="70"/>
-              <w:left w:type="dxa" w:w="120"/>
-              <w:bottom w:type="dxa" w:w="70"/>
-              <w:right w:type="dxa" w:w="120"/>
-            </w:tcMar>
-          </w:tcPr>
-          <w:p>
-            <w:pPr>
-              <w:spacing w:after="0" w:line="240"/>
-              <w:jc w:val="right"/>
-            </w:pPr>
-            <w:r>
-              <w:rPr>
-                <w:rFonts w:ascii="Calibri" w:cs="Calibri" w:eastAsia="Calibri" w:hAnsi="Calibri"/>
-                <w:color w:val="15201C"/>
-                <w:sz w:val="18"/>
-                <w:szCs w:val="18"/>
-              </w:rPr>
-              <w:t xml:space="preserve">1</w:t>
-            </w:r>
-          </w:p>
-        </w:tc>
-        <w:tc>
-          <w:tcPr>
-            <w:tcW w:type="dxa" w:w="1700"/>
-            <w:tcBorders>
-              <w:top w:val="single" w:color="DDE2DE" w:sz="4"/>
-              <w:left w:val="single" w:color="DDE2DE" w:sz="4"/>
-              <w:bottom w:val="single" w:color="DDE2DE" w:sz="4"/>
-              <w:right w:val="single" w:color="DDE2DE" w:sz="4"/>
-            </w:tcBorders>
-            <w:tcMar>
-              <w:top w:type="dxa" w:w="70"/>
-              <w:left w:type="dxa" w:w="120"/>
-              <w:bottom w:type="dxa" w:w="70"/>
-              <w:right w:type="dxa" w:w="120"/>
-            </w:tcMar>
-          </w:tcPr>
-          <w:p>
-            <w:pPr>
-              <w:spacing w:after="0" w:line="240"/>
-              <w:jc w:val="right"/>
-            </w:pPr>
-            <w:r>
-              <w:rPr>
-                <w:rFonts w:ascii="Calibri" w:cs="Calibri" w:eastAsia="Calibri" w:hAnsi="Calibri"/>
-                <w:color w:val="15201C"/>
-                <w:sz w:val="18"/>
-                <w:szCs w:val="18"/>
-              </w:rPr>
-              <w:t xml:space="preserve">0.3%</w:t>
-            </w:r>
-          </w:p>
-        </w:tc>
-      </w:tr>
-      <w:tr>
-        <w:tc>
-          <w:tcPr>
-            <w:tcW w:type="dxa" w:w="5080"/>
-            <w:tcBorders>
-              <w:top w:val="single" w:color="DDE2DE" w:sz="4"/>
-              <w:left w:val="single" w:color="DDE2DE" w:sz="4"/>
-              <w:bottom w:val="single" w:color="DDE2DE" w:sz="4"/>
-              <w:right w:val="single" w:color="DDE2DE" w:sz="4"/>
-            </w:tcBorders>
             <w:shd w:fill="EDF0EC" w:color="auto" w:val="clear"/>
             <w:tcMar>
               <w:top w:type="dxa" w:w="70"/>
@@ -3773,14 +3643,16 @@
     </w:tbl>
     <w:p>
       <w:pPr>
-        <w:spacing w:after="80"/>
+        <w:spacing w:after="140" w:before="100" w:line="246"/>
       </w:pPr>
       <w:r>
         <w:rPr>
-          <w:sz w:val="2"/>
-          <w:szCs w:val="2"/>
+          <w:rFonts w:ascii="Calibri" w:cs="Calibri" w:eastAsia="Calibri" w:hAnsi="Calibri"/>
+          <w:color w:val="5C6862"/>
+          <w:sz w:val="17"/>
+          <w:szCs w:val="17"/>
         </w:rPr>
-        <w:t xml:space="preserve"/>
+        <w:t xml:space="preserve">Shares are of all 344 admissions. One further admission has unresolved residence and is not attributed to a group.</w:t>
       </w:r>
     </w:p>
     <w:tbl>

</xml_diff>